<commit_message>
Chico Anysio: revisão da Parte 1
Co-Authored-By: Claude Opus 5.5 <noreply@anthropic.com>
Claude-Session: https://claude.ai/code/session_01MJjUEEZrxQDEUifKK2vj9g
</commit_message>
<xml_diff>
--- a/roteiros/chico-anysio/Chico_Parte1.docx
+++ b/roteiros/chico-anysio/Chico_Parte1.docx
@@ -87,7 +87,7 @@
         <w:rPr>
           <w:color w:val="C00000"/>
         </w:rPr>
-        <w:t>Guarde essa data. Porque, nos anos seguintes, os filhos, a viúva e a Justiça iam passar a fazer a mesma pergunta. E a resposta que apareceu foi muito diferente do que qualquer pessoa esperaria do artista mais bem pago do país.</w:t>
+        <w:t>Guarde essa data. Porque, nos anos seguintes, a família e a Justiça iam passar a fazer a mesma pergunta. E o que apareceu foi muito diferente do que qualquer pessoa esperaria do artista mais bem pago do país.</w:t>
       </w:r>
     </w:p>
     <w:p>
@@ -95,7 +95,7 @@
         <w:rPr>
           <w:color w:val="000000"/>
         </w:rPr>
-        <w:t>Para entender como isso aconteceu, é preciso voltar quase oitenta anos no tempo.</w:t>
+        <w:t>Para entender como isso aconteceu, é preciso voltar mais de oitenta anos no tempo.</w:t>
       </w:r>
     </w:p>
     <w:p>
@@ -135,7 +135,7 @@
         <w:rPr>
           <w:color w:val="000000"/>
         </w:rPr>
-        <w:t>Segundo as biografias, o menino teve uma infância confortável. Casa boa e família grande, com irmãos que, anos depois, também iam seguir carreira artística.</w:t>
+        <w:t>Segundo as biografias, o menino teve uma infância confortável, numa família rica, com irmãos que, anos depois, também iam seguir carreira artística.</w:t>
       </w:r>
     </w:p>
     <w:p>
@@ -271,7 +271,7 @@
         <w:rPr>
           <w:color w:val="000000"/>
         </w:rPr>
-        <w:t>Ganhava tanto que, segundo as biografias, chegou a ser impedido de participar de alguns concursos. Ele vencia sempre, e os outros candidatos não tinham chance.</w:t>
+        <w:t>Ganhava tanto que, segundo as biografias, chegou a ser impedido de participar de alguns concursos. Ele saía vencedor quase sempre.</w:t>
       </w:r>
     </w:p>
     <w:p>
@@ -279,7 +279,7 @@
         <w:rPr>
           <w:color w:val="000000"/>
         </w:rPr>
-        <w:t>Em mil novecentos e quarenta e sete, venceu um dos programas de calouros mais conhecidos da época, apresentado pelo radialista Renato Murce.</w:t>
+        <w:t>Em mil novecentos e quarenta e sete, venceu o Papel Carbono, um dos programas de calouros mais conhecidos da época, apresentado pelo radialista Renato Murce.</w:t>
       </w:r>
     </w:p>
     <w:p>

</xml_diff>